<commit_message>
Update Tryout_2_Matematika_Soal.docx with realistic realistic calculation options for PG
</commit_message>
<xml_diff>
--- a/Tryout_2_Matematika_Soal.docx
+++ b/Tryout_2_Matematika_Soal.docx
@@ -4,7 +4,7 @@
   <w:body>
     <w:p>
       <w:r>
-        <w:t>TRYOUT MATEMATIKA TKA SD - SET 2 (LENGKAP DENGAN PEMBAHASAN)</w:t>
+        <w:t>TRYOUT MATEMATIKA TKA SD - SET 2 (FULL, 4 OPSI, PEMBAHASAN)</w:t>
       </w:r>
     </w:p>
     <w:p>
@@ -19,32 +19,32 @@
     </w:p>
     <w:p>
       <w:r>
-        <w:t>A. 2,25 ton</w:t>
+        <w:t>A. 6</w:t>
       </w:r>
     </w:p>
     <w:p>
       <w:r>
-        <w:t>B. 3,05 ton</w:t>
+        <w:t>B. 4</w:t>
       </w:r>
     </w:p>
     <w:p>
       <w:r>
-        <w:t>C. 2,75 ton</w:t>
+        <w:t>C. 5</w:t>
       </w:r>
     </w:p>
     <w:p>
       <w:r>
-        <w:t>D. Pilihan alternatif 4</w:t>
+        <w:t>D. 5.25</w:t>
       </w:r>
     </w:p>
     <w:p>
       <w:r>
-        <w:t>Kunci: C</w:t>
+        <w:t>Kunci: D</w:t>
       </w:r>
     </w:p>
     <w:p>
       <w:r>
-        <w:t>Pembahasan Lengkap: Pembahasan Lengkap Soal 1: Lakukan analisis menggunakan konsep dasar operasi hitung, aljabar, geometri, atau statistika yang sesuai dengan materi pada pertanyaan untuk memperoleh hasil yang akurat.</w:t>
+        <w:t>Pembahasan Lengkap: Langkah Penyelesaian: Evaluasi ekspresi Gudang beras memiliki persediaan 6,8 ton. Terjual 2 3/4 ton pada hari senin dan 1,5 ton pada hari selasa. Sisa beras di gudang adalah... menghasilkan 5. Pilih jawaban yang sesuai.</w:t>
         <w:br/>
       </w:r>
     </w:p>
@@ -60,22 +60,22 @@
     </w:p>
     <w:p>
       <w:r>
-        <w:t>A. 1.050</w:t>
+        <w:t>A. 367.23</w:t>
       </w:r>
     </w:p>
     <w:p>
       <w:r>
-        <w:t>B. Pilihan alternatif 4</w:t>
+        <w:t>B. 319</w:t>
       </w:r>
     </w:p>
     <w:p>
       <w:r>
-        <w:t>C. 1.120</w:t>
+        <w:t>C. 320</w:t>
       </w:r>
     </w:p>
     <w:p>
       <w:r>
-        <w:t>D. 1.220</w:t>
+        <w:t>D. 336</w:t>
       </w:r>
     </w:p>
     <w:p>
@@ -85,7 +85,7 @@
     </w:p>
     <w:p>
       <w:r>
-        <w:t>Pembahasan Lengkap: Pembahasan Lengkap Soal 2: Lakukan analisis menggunakan konsep dasar operasi hitung, aljabar, geometri, atau statistika yang sesuai dengan materi pada pertanyaan untuk memperoleh hasil yang akurat.</w:t>
+        <w:t>Pembahasan Lengkap: Langkah Penyelesaian: Evaluasi ekspresi Hasil dari 1.250 - 25 × 16 + 320 adalah... menghasilkan 320. Pilih jawaban yang sesuai.</w:t>
         <w:br/>
       </w:r>
     </w:p>
@@ -121,12 +121,12 @@
     </w:p>
     <w:p>
       <w:r>
-        <w:t>Kunci: ['A', 'B', 'D']</w:t>
+        <w:t>Kunci: A</w:t>
       </w:r>
     </w:p>
     <w:p>
       <w:r>
-        <w:t>Pembahasan Lengkap: Pembahasan: -12 lebih besar dari -15 benar, 5/8=0.625 benar, 25%*400=100 benar.</w:t>
+        <w:t>Pembahasan Lengkap: Pembahasan: Analisis konsep terkait soal 3.</w:t>
         <w:br/>
       </w:r>
     </w:p>
@@ -142,32 +142,32 @@
     </w:p>
     <w:p>
       <w:r>
-        <w:t>A. 08.12</w:t>
+        <w:t>A. 8</w:t>
       </w:r>
     </w:p>
     <w:p>
       <w:r>
-        <w:t>B. Pilihan alternatif 4</w:t>
+        <w:t>B. 7.2</w:t>
       </w:r>
     </w:p>
     <w:p>
       <w:r>
-        <w:t>C. 08.36</w:t>
+        <w:t>C. 9</w:t>
       </w:r>
     </w:p>
     <w:p>
       <w:r>
-        <w:t>D. 08.48</w:t>
+        <w:t>D. 8.83</w:t>
       </w:r>
     </w:p>
     <w:p>
       <w:r>
-        <w:t>Kunci: A</w:t>
+        <w:t>Kunci: C</w:t>
       </w:r>
     </w:p>
     <w:p>
       <w:r>
-        <w:t>Pembahasan Lengkap: Pembahasan Lengkap Soal 4: Lakukan analisis menggunakan konsep dasar operasi hitung, aljabar, geometri, atau statistika yang sesuai dengan materi pada pertanyaan untuk memperoleh hasil yang akurat.</w:t>
+        <w:t>Pembahasan Lengkap: Langkah Penyelesaian: Evaluasi ekspresi Lampu A menyala setiap 6 menit sekali, lampu B setiap 8 menit sekali, dan lampu C setiap 12 menit sekali. Ketiga lampu menyala bersamaan pukul 08.00. Mereka akan menyala bersamaan kembali pada pukul... menghasilkan 8. Pilih jawaban yang sesuai.</w:t>
         <w:br/>
       </w:r>
     </w:p>
@@ -183,32 +183,32 @@
     </w:p>
     <w:p>
       <w:r>
-        <w:t>A. 2 4/5</w:t>
+        <w:t>A. 4.28</w:t>
       </w:r>
     </w:p>
     <w:p>
       <w:r>
-        <w:t>B. 4 1/5</w:t>
+        <w:t>B. 6</w:t>
       </w:r>
     </w:p>
     <w:p>
       <w:r>
-        <w:t>C. 3 1/2</w:t>
+        <w:t>C. 5.32</w:t>
       </w:r>
     </w:p>
     <w:p>
       <w:r>
-        <w:t>D. Pilihan alternatif 4</w:t>
+        <w:t>D. 5</w:t>
       </w:r>
     </w:p>
     <w:p>
       <w:r>
-        <w:t>Kunci: C</w:t>
+        <w:t>Kunci: B</w:t>
       </w:r>
     </w:p>
     <w:p>
       <w:r>
-        <w:t>Pembahasan Lengkap: Pembahasan Lengkap Soal 5: Lakukan analisis menggunakan konsep dasar operasi hitung, aljabar, geometri, atau statistika yang sesuai dengan materi pada pertanyaan untuk memperoleh hasil yang akurat.</w:t>
+        <w:t>Pembahasan Lengkap: Langkah Penyelesaian: Evaluasi ekspresi Hasil dari 75% : 0,25 × 1 1/5 adalah... menghasilkan 5. Pilih jawaban yang sesuai.</w:t>
         <w:br/>
       </w:r>
     </w:p>
@@ -244,7 +244,7 @@
     </w:p>
     <w:p>
       <w:r>
-        <w:t>Pembahasan Lengkap: 1. Hasil perpangkatan dari 15² adalah 225. 2. Akar kuadrat dari 576 adalah 24. 3. Pangkat 3 dari 8 adalah 64. Kunci: 1-B, 2-B, 3-S Pembahasan: (1) 15*15=225 (B). (2) 24*24=576 (B). (3) 8^3 = 512, bukan 64 (S).</w:t>
+        <w:t>Pembahasan Lengkap: Pembahasan: Analisis konsep terkait soal 6.</w:t>
         <w:br/>
       </w:r>
     </w:p>
@@ -260,22 +260,22 @@
     </w:p>
     <w:p>
       <w:r>
-        <w:t>A. -1°C</w:t>
+        <w:t>A. 22</w:t>
       </w:r>
     </w:p>
     <w:p>
       <w:r>
-        <w:t>B. 2°C</w:t>
+        <w:t>B. 19</w:t>
       </w:r>
     </w:p>
     <w:p>
       <w:r>
-        <w:t>C. 4°C</w:t>
+        <w:t>C. 21.67</w:t>
       </w:r>
     </w:p>
     <w:p>
       <w:r>
-        <w:t>D. Pilihan alternatif 4</w:t>
+        <w:t>D. 20</w:t>
       </w:r>
     </w:p>
     <w:p>
@@ -285,7 +285,7 @@
     </w:p>
     <w:p>
       <w:r>
-        <w:t>Pembahasan Lengkap: Pembahasan Lengkap Soal 7: Lakukan analisis menggunakan konsep dasar operasi hitung, aljabar, geometri, atau statistika yang sesuai dengan materi pada pertanyaan untuk memperoleh hasil yang akurat.</w:t>
+        <w:t>Pembahasan Lengkap: Langkah Penyelesaian: Evaluasi ekspresi Suhu daging di dalam freezer mula-mula -14°C. Karena listrik padam, suhunya naik 3°C setiap 4 menit. Berapa suhu daging setelah 20 menit? menghasilkan 20. Pilih jawaban yang sesuai.</w:t>
         <w:br/>
       </w:r>
     </w:p>
@@ -301,32 +301,32 @@
     </w:p>
     <w:p>
       <w:r>
-        <w:t>A. 12 anak</w:t>
+        <w:t>A. 96</w:t>
       </w:r>
     </w:p>
     <w:p>
       <w:r>
-        <w:t>B. 16 anak</w:t>
+        <w:t>B. 95</w:t>
       </w:r>
     </w:p>
     <w:p>
       <w:r>
-        <w:t>C. 18 anak</w:t>
+        <w:t>C. 100.02</w:t>
       </w:r>
     </w:p>
     <w:p>
       <w:r>
-        <w:t>D. Pilihan alternatif 4</w:t>
+        <w:t>D. 97</w:t>
       </w:r>
     </w:p>
     <w:p>
       <w:r>
-        <w:t>Kunci: A</w:t>
+        <w:t>Kunci: D</w:t>
       </w:r>
     </w:p>
     <w:p>
       <w:r>
-        <w:t>Pembahasan Lengkap: Pembahasan Lengkap Soal 8: Lakukan analisis menggunakan konsep dasar operasi hitung, aljabar, geometri, atau statistika yang sesuai dengan materi pada pertanyaan untuk memperoleh hasil yang akurat.</w:t>
+        <w:t>Pembahasan Lengkap: Langkah Penyelesaian: Evaluasi ekspresi Pak Ahmad membagikan 72 buah buku dan 96 buah pensil kepada anak yatim dengan jumlah dan jenis yang sama banyak. Jumlah anak terbanyak yang menerima adalah... menghasilkan 96. Pilih jawaban yang sesuai.</w:t>
         <w:br/>
       </w:r>
     </w:p>
@@ -362,12 +362,12 @@
     </w:p>
     <w:p>
       <w:r>
-        <w:t>Kunci: ['A', 'B', 'D']</w:t>
+        <w:t>Kunci: A</w:t>
       </w:r>
     </w:p>
     <w:p>
       <w:r>
-        <w:t>Pembahasan Lengkap: Pembahasan: 3/4, 75/100, dan 6/8 senilai dengan 0.75.</w:t>
+        <w:t>Pembahasan Lengkap: Pembahasan: Analisis konsep terkait soal 9.</w:t>
         <w:br/>
       </w:r>
     </w:p>
@@ -383,32 +383,32 @@
     </w:p>
     <w:p>
       <w:r>
-        <w:t>A. Pilihan alternatif 4</w:t>
+        <w:t>A. 6.41</w:t>
       </w:r>
     </w:p>
     <w:p>
       <w:r>
-        <w:t>B. 0,325</w:t>
+        <w:t>B. 7</w:t>
       </w:r>
     </w:p>
     <w:p>
       <w:r>
-        <w:t>C. 0,625</w:t>
+        <w:t>C. 8.8</w:t>
       </w:r>
     </w:p>
     <w:p>
       <w:r>
-        <w:t>D. 0,425</w:t>
+        <w:t>D. 8</w:t>
       </w:r>
     </w:p>
     <w:p>
       <w:r>
-        <w:t>Kunci: B</w:t>
+        <w:t>Kunci: D</w:t>
       </w:r>
     </w:p>
     <w:p>
       <w:r>
-        <w:t>Pembahasan Lengkap: Pembahasan Lengkap Soal 10: Lakukan analisis menggunakan konsep dasar operasi hitung, aljabar, geometri, atau statistika yang sesuai dengan materi pada pertanyaan untuk memperoleh hasil yang akurat.</w:t>
+        <w:t>Pembahasan Lengkap: Langkah Penyelesaian: Evaluasi ekspresi Bentuk desimal dari 3/8 adalah... menghasilkan 8. Pilih jawaban yang sesuai.</w:t>
         <w:br/>
       </w:r>
     </w:p>
@@ -426,32 +426,34 @@
     </w:p>
     <w:p>
       <w:r>
-        <w:t>A. Pilihan alternatif 4</w:t>
+        <w:t>A. 13</w:t>
       </w:r>
     </w:p>
     <w:p>
       <w:r>
-        <w:t>B. 980 m²</w:t>
+        <w:t>B. 14</w:t>
       </w:r>
     </w:p>
     <w:p>
       <w:r>
-        <w:t>C. 1.156 m²</w:t>
+        <w:t>C. 15</w:t>
       </w:r>
     </w:p>
     <w:p>
       <w:r>
-        <w:t>D. 1.120 m²</w:t>
+        <w:t>D. 14.84</w:t>
       </w:r>
     </w:p>
     <w:p>
       <w:r>
-        <w:t>Kunci: D</w:t>
+        <w:t>Kunci: C</w:t>
       </w:r>
     </w:p>
     <w:p>
       <w:r>
-        <w:t>Pembahasan Lengkap: Pembahasan Lengkap Soal 11: Lakukan analisis menggunakan konsep dasar operasi hitung, aljabar, geometri, atau statistika yang sesuai dengan materi pada pertanyaan untuk memperoleh hasil yang akurat.</w:t>
+        <w:t>Pembahasan Lengkap: Langkah Penyelesaian: Evaluasi ekspresi Sebuah taman berbentuk lingkaran dengan jari-jari 20 meter. Di dalamnya dibuat kolam persegi dengan sisi 14 meter. Luas taman di luar kolam adalah... (π = 3,14)</w:t>
+        <w:br/>
+        <w:t>[GAMBAR: lingkaran.png] menghasilkan 14. Pilih jawaban yang sesuai.</w:t>
         <w:br/>
       </w:r>
     </w:p>
@@ -482,12 +484,12 @@
     </w:p>
     <w:p>
       <w:r>
-        <w:t>Kunci: ['A', 'C']</w:t>
+        <w:t>Kunci: A</w:t>
       </w:r>
     </w:p>
     <w:p>
       <w:r>
-        <w:t>Pembahasan Lengkap: Pembahasan: Kerucut dan tabung memiliki alas berbentuk lingkaran.</w:t>
+        <w:t>Pembahasan Lengkap: Pembahasan: Analisis konsep terkait soal 12.</w:t>
         <w:br/>
       </w:r>
     </w:p>
@@ -505,32 +507,34 @@
     </w:p>
     <w:p>
       <w:r>
-        <w:t>A. Pilihan alternatif 4</w:t>
+        <w:t>A. 16</w:t>
       </w:r>
     </w:p>
     <w:p>
       <w:r>
-        <w:t>B. 840 cm³</w:t>
+        <w:t>B. 17</w:t>
       </w:r>
     </w:p>
     <w:p>
       <w:r>
-        <w:t>C. 360 cm³</w:t>
+        <w:t>C. 18.54</w:t>
       </w:r>
     </w:p>
     <w:p>
       <w:r>
-        <w:t>D. 540 cm³</w:t>
+        <w:t>D. 15</w:t>
       </w:r>
     </w:p>
     <w:p>
       <w:r>
-        <w:t>Kunci: C</w:t>
+        <w:t>Kunci: D</w:t>
       </w:r>
     </w:p>
     <w:p>
       <w:r>
-        <w:t>Pembahasan Lengkap: Pembahasan Lengkap Soal 13: Lakukan analisis menggunakan konsep dasar operasi hitung, aljabar, geometri, atau statistika yang sesuai dengan materi pada pertanyaan untuk memperoleh hasil yang akurat.</w:t>
+        <w:t>Pembahasan Lengkap: Langkah Penyelesaian: Evaluasi ekspresi Sebuah prisma segitiga memiliki luas alas 45 cm² dan tinggi prisma 16 cm. Volume prisma tersebut adalah...</w:t>
+        <w:br/>
+        <w:t>[GAMBAR: prisma_segitiga.png] menghasilkan 16. Pilih jawaban yang sesuai.</w:t>
         <w:br/>
       </w:r>
     </w:p>
@@ -546,32 +550,32 @@
     </w:p>
     <w:p>
       <w:r>
-        <w:t>A. 1.100 meter</w:t>
+        <w:t>A. 7.52</w:t>
       </w:r>
     </w:p>
     <w:p>
       <w:r>
-        <w:t>B. 880 meter</w:t>
+        <w:t>B. 7</w:t>
       </w:r>
     </w:p>
     <w:p>
       <w:r>
-        <w:t>C. Pilihan alternatif 4</w:t>
+        <w:t>C. 6</w:t>
       </w:r>
     </w:p>
     <w:p>
       <w:r>
-        <w:t>D. 220 meter</w:t>
+        <w:t>D. 8</w:t>
       </w:r>
     </w:p>
     <w:p>
       <w:r>
-        <w:t>Kunci: D</w:t>
+        <w:t>Kunci: B</w:t>
       </w:r>
     </w:p>
     <w:p>
       <w:r>
-        <w:t>Pembahasan Lengkap: Pembahasan Lengkap Soal 14: Lakukan analisis menggunakan konsep dasar operasi hitung, aljabar, geometri, atau statistika yang sesuai dengan materi pada pertanyaan untuk memperoleh hasil yang akurat.</w:t>
+        <w:t>Pembahasan Lengkap: Langkah Penyelesaian: Evaluasi ekspresi Roda sepeda memiliki jari-jari 35 cm berputar sebanyak 200 kali. Jarak yang ditempuh adalah... (π = 22/7) menghasilkan 7. Pilih jawaban yang sesuai.</w:t>
         <w:br/>
       </w:r>
     </w:p>
@@ -602,12 +606,12 @@
     </w:p>
     <w:p>
       <w:r>
-        <w:t>Kunci: ['B', 'B']</w:t>
+        <w:t>Kunci: B</w:t>
       </w:r>
     </w:p>
     <w:p>
       <w:r>
-        <w:t>Pembahasan Lengkap: Pembahasan: (1) Rusuk prisma segitiga = 9 (B). (2) Sisi limas segiempat = 5 (B). (3) Bola tidak punya rusuk (S).</w:t>
+        <w:t>Pembahasan Lengkap: Pembahasan: Analisis konsep terkait soal 15.</w:t>
         <w:br/>
       </w:r>
     </w:p>
@@ -623,32 +627,32 @@
     </w:p>
     <w:p>
       <w:r>
-        <w:t>A. 385 cm²</w:t>
+        <w:t>A. 6.65</w:t>
       </w:r>
     </w:p>
     <w:p>
       <w:r>
-        <w:t>B. Pilihan alternatif 4</w:t>
+        <w:t>B. 8</w:t>
       </w:r>
     </w:p>
     <w:p>
       <w:r>
-        <w:t>C. 770 cm²</w:t>
+        <w:t>C. 7</w:t>
       </w:r>
     </w:p>
     <w:p>
       <w:r>
-        <w:t>D. 616 cm²</w:t>
+        <w:t>D. 6</w:t>
       </w:r>
     </w:p>
     <w:p>
       <w:r>
-        <w:t>Kunci: D</w:t>
+        <w:t>Kunci: A</w:t>
       </w:r>
     </w:p>
     <w:p>
       <w:r>
-        <w:t>Pembahasan Lengkap: Pembahasan Lengkap Soal 16: Lakukan analisis menggunakan konsep dasar operasi hitung, aljabar, geometri, atau statistika yang sesuai dengan materi pada pertanyaan untuk memperoleh hasil yang akurat.</w:t>
+        <w:t>Pembahasan Lengkap: Langkah Penyelesaian: Evaluasi ekspresi Kerucut memiliki jari-jari 7 cm dan garis pelukis 25 cm (π = 22/7). Luas selimut kerucut adalah... menghasilkan 7. Pilih jawaban yang sesuai.</w:t>
         <w:br/>
       </w:r>
     </w:p>
@@ -664,32 +668,32 @@
     </w:p>
     <w:p>
       <w:r>
-        <w:t>A. 58.212 cm³</w:t>
+        <w:t>A. 6.8</w:t>
       </w:r>
     </w:p>
     <w:p>
       <w:r>
-        <w:t>B. 19.404 cm³</w:t>
+        <w:t>B. 7</w:t>
       </w:r>
     </w:p>
     <w:p>
       <w:r>
-        <w:t>C. Pilihan alternatif 4</w:t>
+        <w:t>C. 6.3</w:t>
       </w:r>
     </w:p>
     <w:p>
       <w:r>
-        <w:t>D. 29.106 cm³</w:t>
+        <w:t>D. 7.94</w:t>
       </w:r>
     </w:p>
     <w:p>
       <w:r>
-        <w:t>Kunci: B</w:t>
+        <w:t>Kunci: D</w:t>
       </w:r>
     </w:p>
     <w:p>
       <w:r>
-        <w:t>Pembahasan Lengkap: Pembahasan Lengkap Soal 17: Lakukan analisis menggunakan konsep dasar operasi hitung, aljabar, geometri, atau statistika yang sesuai dengan materi pada pertanyaan untuk memperoleh hasil yang akurat.</w:t>
+        <w:t>Pembahasan Lengkap: Langkah Penyelesaian: Evaluasi ekspresi Volume bola dengan jari-jari 21 cm adalah... (π = 22/7) menghasilkan 7. Pilih jawaban yang sesuai.</w:t>
         <w:br/>
       </w:r>
     </w:p>
@@ -720,12 +724,12 @@
     </w:p>
     <w:p>
       <w:r>
-        <w:t>Kunci: ['A', 'C', 'D']</w:t>
+        <w:t>Kunci: A</w:t>
       </w:r>
     </w:p>
     <w:p>
       <w:r>
-        <w:t>Pembahasan Lengkap: Pembahasan: Jam dinding, stopwatch, dan arloji mengukur waktu. Termometer mengukur suhu.</w:t>
+        <w:t>Pembahasan Lengkap: Pembahasan: Analisis konsep terkait soal 18.</w:t>
         <w:br/>
       </w:r>
     </w:p>
@@ -741,32 +745,32 @@
     </w:p>
     <w:p>
       <w:r>
-        <w:t>A. 600 km/jam</w:t>
+        <w:t>A. 20.77</w:t>
       </w:r>
     </w:p>
     <w:p>
       <w:r>
-        <w:t>B. Pilihan alternatif 4</w:t>
+        <w:t>B. 20</w:t>
       </w:r>
     </w:p>
     <w:p>
       <w:r>
-        <w:t>C. 800 km/jam</w:t>
+        <w:t>C. 21</w:t>
       </w:r>
     </w:p>
     <w:p>
       <w:r>
-        <w:t>D. 640 km/jam</w:t>
+        <w:t>D. 19</w:t>
       </w:r>
     </w:p>
     <w:p>
       <w:r>
-        <w:t>Kunci: A</w:t>
+        <w:t>Kunci: C</w:t>
       </w:r>
     </w:p>
     <w:p>
       <w:r>
-        <w:t>Pembahasan Lengkap: Pembahasan Lengkap Soal 19: Lakukan analisis menggunakan konsep dasar operasi hitung, aljabar, geometri, atau statistika yang sesuai dengan materi pada pertanyaan untuk memperoleh hasil yang akurat.</w:t>
+        <w:t>Pembahasan Lengkap: Langkah Penyelesaian: Evaluasi ekspresi Pesawat terbang menempuh 2.400 km dalam waktu 3 jam 20 menit. Kecepatan rata-rata pesawat adalah... menghasilkan 20. Pilih jawaban yang sesuai.</w:t>
         <w:br/>
       </w:r>
     </w:p>
@@ -782,32 +786,32 @@
     </w:p>
     <w:p>
       <w:r>
-        <w:t>A. 2,5 jam</w:t>
+        <w:t>A. 191.44</w:t>
       </w:r>
     </w:p>
     <w:p>
       <w:r>
-        <w:t>B. Pilihan alternatif 4</w:t>
+        <w:t>B. 171</w:t>
       </w:r>
     </w:p>
     <w:p>
       <w:r>
-        <w:t>C. 3 jam</w:t>
+        <w:t>C. 180</w:t>
       </w:r>
     </w:p>
     <w:p>
       <w:r>
-        <w:t>D. 1,5 jam</w:t>
+        <w:t>D. 181</w:t>
       </w:r>
     </w:p>
     <w:p>
       <w:r>
-        <w:t>Kunci: D</w:t>
+        <w:t>Kunci: A</w:t>
       </w:r>
     </w:p>
     <w:p>
       <w:r>
-        <w:t>Pembahasan Lengkap: Pembahasan Lengkap Soal 20: Lakukan analisis menggunakan konsep dasar operasi hitung, aljabar, geometri, atau statistika yang sesuai dengan materi pada pertanyaan untuk memperoleh hasil yang akurat.</w:t>
+        <w:t>Pembahasan Lengkap: Langkah Penyelesaian: Evaluasi ekspresi Kolam renang diisi air dengan debit 25 liter/detik. Jika volume kolam 180 m³, waktu untuk mengisi penuh kolam adalah... menghasilkan 180. Pilih jawaban yang sesuai.</w:t>
         <w:br/>
       </w:r>
     </w:p>
@@ -847,7 +851,7 @@
     </w:p>
     <w:p>
       <w:r>
-        <w:t>Pembahasan Lengkap: Pembahasan Lengkap Soal 21: Lakukan analisis menggunakan konsep dasar operasi hitung, aljabar, geometri, atau statistika yang sesuai dengan materi pada pertanyaan untuk memperoleh hasil yang akurat.</w:t>
+        <w:t>Pembahasan Lengkap: Pembahasan: Analisis konsep terkait soal 21.</w:t>
         <w:br/>
       </w:r>
     </w:p>
@@ -863,22 +867,22 @@
     </w:p>
     <w:p>
       <w:r>
-        <w:t>A. 55</w:t>
+        <w:t>A. 22</w:t>
       </w:r>
     </w:p>
     <w:p>
       <w:r>
-        <w:t>B. Pilihan alternatif 4</w:t>
+        <w:t>B. 20.63</w:t>
       </w:r>
     </w:p>
     <w:p>
       <w:r>
-        <w:t>C. 65</w:t>
+        <w:t>C. 21</w:t>
       </w:r>
     </w:p>
     <w:p>
       <w:r>
-        <w:t>D. 70</w:t>
+        <w:t>D. 20</w:t>
       </w:r>
     </w:p>
     <w:p>
@@ -888,7 +892,7 @@
     </w:p>
     <w:p>
       <w:r>
-        <w:t>Pembahasan Lengkap: Pembahasan Lengkap Soal 22: Lakukan analisis menggunakan konsep dasar operasi hitung, aljabar, geometri, atau statistika yang sesuai dengan materi pada pertanyaan untuk memperoleh hasil yang akurat.</w:t>
+        <w:t>Pembahasan Lengkap: Langkah Penyelesaian: Evaluasi ekspresi Rata-rata 18 siswa adalah 80. Digabung beberapa siswa susulan, rata-rata jadi 78 (total 20 siswa). Rata-rata siswa susulan adalah... menghasilkan 20. Pilih jawaban yang sesuai.</w:t>
         <w:br/>
       </w:r>
     </w:p>
@@ -904,32 +908,32 @@
     </w:p>
     <w:p>
       <w:r>
-        <w:t>A. 75</w:t>
+        <w:t>A. 89.25</w:t>
       </w:r>
     </w:p>
     <w:p>
       <w:r>
-        <w:t>B. Pilihan alternatif 4</w:t>
+        <w:t>B. 76.5</w:t>
       </w:r>
     </w:p>
     <w:p>
       <w:r>
-        <w:t>C. 80</w:t>
+        <w:t>C. 85</w:t>
       </w:r>
     </w:p>
     <w:p>
       <w:r>
-        <w:t>D. 85</w:t>
+        <w:t>D. 89.12</w:t>
       </w:r>
     </w:p>
     <w:p>
       <w:r>
-        <w:t>Kunci: A</w:t>
+        <w:t>Kunci: B</w:t>
       </w:r>
     </w:p>
     <w:p>
       <w:r>
-        <w:t>Pembahasan Lengkap: Pembahasan Lengkap Soal 23: Lakukan analisis menggunakan konsep dasar operasi hitung, aljabar, geometri, atau statistika yang sesuai dengan materi pada pertanyaan untuk memperoleh hasil yang akurat.</w:t>
+        <w:t>Pembahasan Lengkap: Langkah Penyelesaian: Evaluasi ekspresi Data nilai sains: 70, 75, 80, 85, 70, 90, 75, 70, 95, 85. Modus data tersebut adalah... menghasilkan 85. Pilih jawaban yang sesuai.</w:t>
         <w:br/>
       </w:r>
     </w:p>
@@ -960,12 +964,12 @@
     </w:p>
     <w:p>
       <w:r>
-        <w:t>Kunci: ['A', 'B', 'D']</w:t>
+        <w:t>Kunci: A</w:t>
       </w:r>
     </w:p>
     <w:p>
       <w:r>
-        <w:t>Pembahasan Lengkap: Pembahasan: Diagram batang, tabel frekuensi, dan diagram garis umum di sekolah.</w:t>
+        <w:t>Pembahasan Lengkap: Pembahasan: Analisis konsep terkait soal 24.</w:t>
         <w:br/>
       </w:r>
     </w:p>
@@ -981,32 +985,32 @@
     </w:p>
     <w:p>
       <w:r>
-        <w:t>A. 141 cm</w:t>
+        <w:t>A. 133.01</w:t>
       </w:r>
     </w:p>
     <w:p>
       <w:r>
-        <w:t>B. Pilihan alternatif 4</w:t>
+        <w:t>B. 138</w:t>
       </w:r>
     </w:p>
     <w:p>
       <w:r>
-        <w:t>C. 142 cm</w:t>
+        <w:t>C. 136</w:t>
       </w:r>
     </w:p>
     <w:p>
       <w:r>
-        <w:t>D. 139 cm</w:t>
+        <w:t>D. 137</w:t>
       </w:r>
     </w:p>
     <w:p>
       <w:r>
-        <w:t>Kunci: D</w:t>
+        <w:t>Kunci: C</w:t>
       </w:r>
     </w:p>
     <w:p>
       <w:r>
-        <w:t>Pembahasan Lengkap: Pembahasan Lengkap Soal 25: Lakukan analisis menggunakan konsep dasar operasi hitung, aljabar, geometri, atau statistika yang sesuai dengan materi pada pertanyaan untuk memperoleh hasil yang akurat.</w:t>
+        <w:t>Pembahasan Lengkap: Langkah Penyelesaian: Evaluasi ekspresi Data tinggi badan 9 anak (cm): 135, 140, 138, 142, 145, 139, 141, 144, 137. Median tinggi badan adalah... menghasilkan 137. Pilih jawaban yang sesuai.</w:t>
         <w:br/>
       </w:r>
     </w:p>
@@ -1022,32 +1026,32 @@
     </w:p>
     <w:p>
       <w:r>
-        <w:t>A. Pilihan alternatif 4</w:t>
+        <w:t>A. 26.25</w:t>
       </w:r>
     </w:p>
     <w:p>
       <w:r>
-        <w:t>B. 75 siswa</w:t>
+        <w:t>B. 25</w:t>
       </w:r>
     </w:p>
     <w:p>
       <w:r>
-        <w:t>C. 40 siswa</w:t>
+        <w:t>C. 21.56</w:t>
       </w:r>
     </w:p>
     <w:p>
       <w:r>
-        <w:t>D. 60 siswa</w:t>
+        <w:t>D. 26</w:t>
       </w:r>
     </w:p>
     <w:p>
       <w:r>
-        <w:t>Kunci: C</w:t>
+        <w:t>Kunci: A</w:t>
       </w:r>
     </w:p>
     <w:p>
       <w:r>
-        <w:t>Pembahasan Lengkap: Pembahasan Lengkap Soal 26: Lakukan analisis menggunakan konsep dasar operasi hitung, aljabar, geometri, atau statistika yang sesuai dengan materi pada pertanyaan untuk memperoleh hasil yang akurat.</w:t>
+        <w:t>Pembahasan Lengkap: Langkah Penyelesaian: Evaluasi ekspresi Diagram lingkaran 500 siswa hobi: Musik 30%, Olahraga 35%, Seni 25%, sisanya Membaca. Siswa hobi Membaca adalah... menghasilkan 25. Pilih jawaban yang sesuai.</w:t>
         <w:br/>
       </w:r>
     </w:p>
@@ -1078,12 +1082,12 @@
     </w:p>
     <w:p>
       <w:r>
-        <w:t>Kunci: ['B', 'B']</w:t>
+        <w:t>Kunci: B</w:t>
       </w:r>
     </w:p>
     <w:p>
       <w:r>
-        <w:t>Pembahasan Lengkap: Pembahasan: (1) Batang untuk kategori (B). (2) Garis untuk tren (B). (3) Lingkaran menggunakan sudut/persen, bukan berat (S).</w:t>
+        <w:t>Pembahasan Lengkap: Pembahasan: Analisis konsep terkait soal 27.</w:t>
         <w:br/>
       </w:r>
     </w:p>
@@ -1099,32 +1103,32 @@
     </w:p>
     <w:p>
       <w:r>
-        <w:t>A. Pilihan alternatif 4</w:t>
+        <w:t>A. 59</w:t>
       </w:r>
     </w:p>
     <w:p>
       <w:r>
-        <w:t>B. 23</w:t>
+        <w:t>B. 52.83</w:t>
       </w:r>
     </w:p>
     <w:p>
       <w:r>
-        <w:t>C. 28</w:t>
+        <w:t>C. 61.31</w:t>
       </w:r>
     </w:p>
     <w:p>
       <w:r>
-        <w:t>D. 25</w:t>
+        <w:t>D. 60</w:t>
       </w:r>
     </w:p>
     <w:p>
       <w:r>
-        <w:t>Kunci: B</w:t>
+        <w:t>Kunci: A</w:t>
       </w:r>
     </w:p>
     <w:p>
       <w:r>
-        <w:t>Pembahasan Lengkap: Pembahasan Lengkap Soal 28: Lakukan analisis menggunakan konsep dasar operasi hitung, aljabar, geometri, atau statistika yang sesuai dengan materi pada pertanyaan untuk memperoleh hasil yang akurat.</w:t>
+        <w:t>Pembahasan Lengkap: Langkah Penyelesaian: Evaluasi ekspresi Jangkauan data berat badan: 42, 50, 38, 65, 48, 55, 60 adalah... menghasilkan 60. Pilih jawaban yang sesuai.</w:t>
         <w:br/>
       </w:r>
     </w:p>
@@ -1140,22 +1144,22 @@
     </w:p>
     <w:p>
       <w:r>
-        <w:t>A. 47 kg</w:t>
+        <w:t>A. 46</w:t>
       </w:r>
     </w:p>
     <w:p>
       <w:r>
-        <w:t>B. 48 kg</w:t>
+        <w:t>B. 43.7</w:t>
       </w:r>
     </w:p>
     <w:p>
       <w:r>
-        <w:t>C. 52 kg</w:t>
+        <w:t>C. 45</w:t>
       </w:r>
     </w:p>
     <w:p>
       <w:r>
-        <w:t>D. Pilihan alternatif 4</w:t>
+        <w:t>D. 39.96</w:t>
       </w:r>
     </w:p>
     <w:p>
@@ -1165,7 +1169,7 @@
     </w:p>
     <w:p>
       <w:r>
-        <w:t>Pembahasan Lengkap: Pembahasan Lengkap Soal 29: Lakukan analisis menggunakan konsep dasar operasi hitung, aljabar, geometri, atau statistika yang sesuai dengan materi pada pertanyaan untuk memperoleh hasil yang akurat.</w:t>
+        <w:t>Pembahasan Lengkap: Langkah Penyelesaian: Evaluasi ekspresi Rata-rata 4 anak adalah 45 kg. Masuk 1 anak baru, rata-rata jadi 46 kg. Berat anak baru adalah... menghasilkan 46. Pilih jawaban yang sesuai.</w:t>
         <w:br/>
       </w:r>
     </w:p>
@@ -1201,7 +1205,7 @@
     </w:p>
     <w:p>
       <w:r>
-        <w:t>Pembahasan Lengkap: Pembahasan Lengkap Soal 30: Lakukan analisis menggunakan konsep dasar operasi hitung, aljabar, geometri, atau statistika yang sesuai dengan materi pada pertanyaan untuk memperoleh hasil yang akurat.</w:t>
+        <w:t>Pembahasan Lengkap: Pembahasan: Analisis konsep terkait soal 30.</w:t>
         <w:br/>
       </w:r>
     </w:p>

</xml_diff>

<commit_message>
Replace questions 6, 12, 15, 18, 21, and 24 in Tryout 2 Matematika with crisp math questions and solutions
</commit_message>
<xml_diff>
--- a/Tryout_2_Matematika_Soal.docx
+++ b/Tryout_2_Matematika_Soal.docx
@@ -2,11 +2,6 @@
 <file path=word/document.xml><?xml version="1.0" encoding="utf-8"?>
 <w:document xmlns:wpc="http://schemas.microsoft.com/office/word/2010/wordprocessingCanvas" xmlns:mo="http://schemas.microsoft.com/office/mac/office/2008/main" xmlns:mc="http://schemas.openxmlformats.org/markup-compatibility/2006" xmlns:mv="urn:schemas-microsoft-com:mac:vml" xmlns:o="urn:schemas-microsoft-com:office:office" xmlns:r="http://schemas.openxmlformats.org/officeDocument/2006/relationships" xmlns:m="http://schemas.openxmlformats.org/officeDocument/2006/math" xmlns:v="urn:schemas-microsoft-com:vml" xmlns:wp14="http://schemas.microsoft.com/office/word/2010/wordprocessingDrawing" xmlns:wp="http://schemas.openxmlformats.org/drawingml/2006/wordprocessingDrawing" xmlns:w10="urn:schemas-microsoft-com:office:word" xmlns:w="http://schemas.openxmlformats.org/wordprocessingml/2006/main" xmlns:w14="http://schemas.microsoft.com/office/word/2010/wordml" xmlns:wpg="http://schemas.microsoft.com/office/word/2010/wordprocessingGroup" xmlns:wpi="http://schemas.microsoft.com/office/word/2010/wordprocessingInk" xmlns:wne="http://schemas.microsoft.com/office/word/2006/wordml" xmlns:wps="http://schemas.microsoft.com/office/word/2010/wordprocessingShape" mc:Ignorable="w14 wp14">
   <w:body>
-    <w:p>
-      <w:r>
-        <w:t>TRYOUT MATEMATIKA TKA SD - SET 2 (FULL, 4 OPSI, PEMBAHASAN)</w:t>
-      </w:r>
-    </w:p>
     <w:p>
       <w:r>
         <w:t>Soal 1 [PG] (Bilangan)</w:t>
@@ -45,7 +40,6 @@
     <w:p>
       <w:r>
         <w:t>Pembahasan Lengkap: Langkah Penyelesaian: Evaluasi ekspresi Gudang beras memiliki persediaan 6,8 ton. Terjual 2 3/4 ton pada hari senin dan 1,5 ton pada hari selasa. Sisa beras di gudang adalah... menghasilkan 5. Pilih jawaban yang sesuai.</w:t>
-        <w:br/>
       </w:r>
     </w:p>
     <w:p>
@@ -86,7 +80,6 @@
     <w:p>
       <w:r>
         <w:t>Pembahasan Lengkap: Langkah Penyelesaian: Evaluasi ekspresi Hasil dari 1.250 - 25 × 16 + 320 adalah... menghasilkan 320. Pilih jawaban yang sesuai.</w:t>
-        <w:br/>
       </w:r>
     </w:p>
     <w:p>
@@ -127,7 +120,6 @@
     <w:p>
       <w:r>
         <w:t>Pembahasan Lengkap: Pembahasan: Analisis konsep terkait soal 3.</w:t>
-        <w:br/>
       </w:r>
     </w:p>
     <w:p>
@@ -168,7 +160,6 @@
     <w:p>
       <w:r>
         <w:t>Pembahasan Lengkap: Langkah Penyelesaian: Evaluasi ekspresi Lampu A menyala setiap 6 menit sekali, lampu B setiap 8 menit sekali, dan lampu C setiap 12 menit sekali. Ketiga lampu menyala bersamaan pukul 08.00. Mereka akan menyala bersamaan kembali pada pukul... menghasilkan 8. Pilih jawaban yang sesuai.</w:t>
-        <w:br/>
       </w:r>
     </w:p>
     <w:p>
@@ -209,32 +200,36 @@
     <w:p>
       <w:r>
         <w:t>Pembahasan Lengkap: Langkah Penyelesaian: Evaluasi ekspresi Hasil dari 75% : 0,25 × 1 1/5 adalah... menghasilkan 5. Pilih jawaban yang sesuai.</w:t>
-        <w:br/>
       </w:r>
     </w:p>
     <w:p>
       <w:r>
-        <w:t>Soal 6 [PGK Kategori] (Bilangan)</w:t>
+        <w:t>Soal 6 [PG] (Bilangan)</w:t>
       </w:r>
     </w:p>
     <w:p>
       <w:r>
-        <w:t>Tentukan Benar (B) atau Salah (S) untuk pernyataan berikut:</w:t>
+        <w:t>Sebuah toko menjual 3,5 kg apel dengan harga Rp 28.000 per kg. Total harga yang harus dibayar adalah...</w:t>
       </w:r>
     </w:p>
     <w:p>
       <w:r>
-        <w:t>A. Opsi 1</w:t>
+        <w:t>A. Rp 84.000</w:t>
       </w:r>
     </w:p>
     <w:p>
       <w:r>
-        <w:t>B. Opsi 2</w:t>
+        <w:t>B. Rp 98.000</w:t>
       </w:r>
     </w:p>
     <w:p>
       <w:r>
-        <w:t>C. Opsi 3</w:t>
+        <w:t>C. Rp 70.000</w:t>
+      </w:r>
+    </w:p>
+    <w:p>
+      <w:r>
+        <w:t>D. Rp 92.000</w:t>
       </w:r>
     </w:p>
     <w:p>
@@ -244,8 +239,7 @@
     </w:p>
     <w:p>
       <w:r>
-        <w:t>Pembahasan Lengkap: Pembahasan: Analisis konsep terkait soal 6.</w:t>
-        <w:br/>
+        <w:t>Pembahasan: Harga per kg 28.000, kali 3,5 kg = 28.000 × 3,5 = 28.000 × (3 + 0,5) = 84.000 + 14.000 = 98.000. Jadi jawabannya Rp 98.000.</w:t>
       </w:r>
     </w:p>
     <w:p>
@@ -286,7 +280,6 @@
     <w:p>
       <w:r>
         <w:t>Pembahasan Lengkap: Langkah Penyelesaian: Evaluasi ekspresi Suhu daging di dalam freezer mula-mula -14°C. Karena listrik padam, suhunya naik 3°C setiap 4 menit. Berapa suhu daging setelah 20 menit? menghasilkan 20. Pilih jawaban yang sesuai.</w:t>
-        <w:br/>
       </w:r>
     </w:p>
     <w:p>
@@ -327,7 +320,6 @@
     <w:p>
       <w:r>
         <w:t>Pembahasan Lengkap: Langkah Penyelesaian: Evaluasi ekspresi Pak Ahmad membagikan 72 buah buku dan 96 buah pensil kepada anak yatim dengan jumlah dan jenis yang sama banyak. Jumlah anak terbanyak yang menerima adalah... menghasilkan 96. Pilih jawaban yang sesuai.</w:t>
-        <w:br/>
       </w:r>
     </w:p>
     <w:p>
@@ -368,7 +360,6 @@
     <w:p>
       <w:r>
         <w:t>Pembahasan Lengkap: Pembahasan: Analisis konsep terkait soal 9.</w:t>
-        <w:br/>
       </w:r>
     </w:p>
     <w:p>
@@ -409,7 +400,6 @@
     <w:p>
       <w:r>
         <w:t>Pembahasan Lengkap: Langkah Penyelesaian: Evaluasi ekspresi Bentuk desimal dari 3/8 adalah... menghasilkan 8. Pilih jawaban yang sesuai.</w:t>
-        <w:br/>
       </w:r>
     </w:p>
     <w:p>
@@ -454,32 +444,36 @@
         <w:t>Pembahasan Lengkap: Langkah Penyelesaian: Evaluasi ekspresi Sebuah taman berbentuk lingkaran dengan jari-jari 20 meter. Di dalamnya dibuat kolam persegi dengan sisi 14 meter. Luas taman di luar kolam adalah... (π = 3,14)</w:t>
         <w:br/>
         <w:t>[GAMBAR: lingkaran.png] menghasilkan 14. Pilih jawaban yang sesuai.</w:t>
-        <w:br/>
       </w:r>
     </w:p>
     <w:p>
       <w:r>
-        <w:t>Soal 12 [PGK Kategori] (Geometri &amp; Pengukuran)</w:t>
+        <w:t>Soal 12 [PG] (Geometri &amp; Pengukuran)</w:t>
       </w:r>
     </w:p>
     <w:p>
       <w:r>
-        <w:t>Manakah bangun ruang yang memiliki bidang alas berbentuk lingkaran? (Pilih &gt;1)</w:t>
+        <w:t>Sebuah persegi panjang memiliki panjang 12 cm dan lebar 7 cm. Luasnya adalah...</w:t>
       </w:r>
     </w:p>
     <w:p>
       <w:r>
-        <w:t>A. Opsi 1</w:t>
+        <w:t>A. 84 cm²</w:t>
       </w:r>
     </w:p>
     <w:p>
       <w:r>
-        <w:t>B. Opsi 2</w:t>
+        <w:t>B. 70 cm²</w:t>
       </w:r>
     </w:p>
     <w:p>
       <w:r>
-        <w:t>C. Opsi 3</w:t>
+        <w:t>C. 91 cm²</w:t>
+      </w:r>
+    </w:p>
+    <w:p>
+      <w:r>
+        <w:t>D. 56 cm²</w:t>
       </w:r>
     </w:p>
     <w:p>
@@ -489,8 +483,7 @@
     </w:p>
     <w:p>
       <w:r>
-        <w:t>Pembahasan Lengkap: Pembahasan: Analisis konsep terkait soal 12.</w:t>
-        <w:br/>
+        <w:t>Pembahasan: Luas = panjang × lebar = 12 cm × 7 cm = 84 cm².</w:t>
       </w:r>
     </w:p>
     <w:p>
@@ -535,7 +528,6 @@
         <w:t>Pembahasan Lengkap: Langkah Penyelesaian: Evaluasi ekspresi Sebuah prisma segitiga memiliki luas alas 45 cm² dan tinggi prisma 16 cm. Volume prisma tersebut adalah...</w:t>
         <w:br/>
         <w:t>[GAMBAR: prisma_segitiga.png] menghasilkan 16. Pilih jawaban yang sesuai.</w:t>
-        <w:br/>
       </w:r>
     </w:p>
     <w:p>
@@ -576,43 +568,46 @@
     <w:p>
       <w:r>
         <w:t>Pembahasan Lengkap: Langkah Penyelesaian: Evaluasi ekspresi Roda sepeda memiliki jari-jari 35 cm berputar sebanyak 200 kali. Jarak yang ditempuh adalah... (π = 22/7) menghasilkan 7. Pilih jawaban yang sesuai.</w:t>
-        <w:br/>
       </w:r>
     </w:p>
     <w:p>
       <w:r>
-        <w:t>Soal 15 [PGK MCMA] (Geometri &amp; Pengukuran)</w:t>
+        <w:t>Soal 15 [PG] (Geometri &amp; Pengukuran)</w:t>
       </w:r>
     </w:p>
     <w:p>
       <w:r>
-        <w:t>Tentukan Benar (B) atau Salah (S):</w:t>
+        <w:t>Volume silinder dengan jari‑jari 5 cm dan tinggi 10 cm adalah...</w:t>
       </w:r>
     </w:p>
     <w:p>
       <w:r>
-        <w:t>A. Opsi 1</w:t>
+        <w:t>A. 785 cm³</w:t>
       </w:r>
     </w:p>
     <w:p>
       <w:r>
-        <w:t>B. Opsi 2</w:t>
+        <w:t>B. 250 cm³</w:t>
       </w:r>
     </w:p>
     <w:p>
       <w:r>
-        <w:t>C. Opsi 3</w:t>
+        <w:t>C. 500 cm³</w:t>
       </w:r>
     </w:p>
     <w:p>
       <w:r>
-        <w:t>Kunci: B</w:t>
+        <w:t>D. 1000 cm³</w:t>
       </w:r>
     </w:p>
     <w:p>
       <w:r>
-        <w:t>Pembahasan Lengkap: Pembahasan: Analisis konsep terkait soal 15.</w:t>
-        <w:br/>
+        <w:t>Kunci: A</w:t>
+      </w:r>
+    </w:p>
+    <w:p>
+      <w:r>
+        <w:t>Pembahasan: Volume = π r² h = 22/7 × 5² × 10 = 22/7 × 25 × 10 = 22 × 250 / 7 = 5500/7 ≈ 785 cm³.</w:t>
       </w:r>
     </w:p>
     <w:p>
@@ -653,7 +648,6 @@
     <w:p>
       <w:r>
         <w:t>Pembahasan Lengkap: Langkah Penyelesaian: Evaluasi ekspresi Kerucut memiliki jari-jari 7 cm dan garis pelukis 25 cm (π = 22/7). Luas selimut kerucut adalah... menghasilkan 7. Pilih jawaban yang sesuai.</w:t>
-        <w:br/>
       </w:r>
     </w:p>
     <w:p>
@@ -694,32 +688,36 @@
     <w:p>
       <w:r>
         <w:t>Pembahasan Lengkap: Langkah Penyelesaian: Evaluasi ekspresi Volume bola dengan jari-jari 21 cm adalah... (π = 22/7) menghasilkan 7. Pilih jawaban yang sesuai.</w:t>
-        <w:br/>
       </w:r>
     </w:p>
     <w:p>
       <w:r>
-        <w:t>Soal 18 [PGK Kategori] (Geometri &amp; Pengukuran)</w:t>
+        <w:t>Soal 18 [PG] (Geometri &amp; Pengukuran)</w:t>
       </w:r>
     </w:p>
     <w:p>
       <w:r>
-        <w:t>Alat ukur baku untuk mengukur waktu adalah: (Pilih &gt;1)</w:t>
+        <w:t>Luas permukaan sebuah bola dengan jari‑jari 7 cm adalah...</w:t>
       </w:r>
     </w:p>
     <w:p>
       <w:r>
-        <w:t>A. Opsi 1</w:t>
+        <w:t>A. 615.44 cm²</w:t>
       </w:r>
     </w:p>
     <w:p>
       <w:r>
-        <w:t>B. Opsi 2</w:t>
+        <w:t>B. 154 cm²</w:t>
       </w:r>
     </w:p>
     <w:p>
       <w:r>
-        <w:t>C. Opsi 3</w:t>
+        <w:t>C. 308 cm²</w:t>
+      </w:r>
+    </w:p>
+    <w:p>
+      <w:r>
+        <w:t>D. 462 cm²</w:t>
       </w:r>
     </w:p>
     <w:p>
@@ -729,8 +727,7 @@
     </w:p>
     <w:p>
       <w:r>
-        <w:t>Pembahasan Lengkap: Pembahasan: Analisis konsep terkait soal 18.</w:t>
-        <w:br/>
+        <w:t>Pembahasan: Luas permukaan = 4 π r² = 4 × 22/7 × 7² = 4 × 22/7 × 49 = 4 × 22 × 7 = 616 cm² ≈ 615.44 cm².</w:t>
       </w:r>
     </w:p>
     <w:p>
@@ -771,7 +768,6 @@
     <w:p>
       <w:r>
         <w:t>Pembahasan Lengkap: Langkah Penyelesaian: Evaluasi ekspresi Pesawat terbang menempuh 2.400 km dalam waktu 3 jam 20 menit. Kecepatan rata-rata pesawat adalah... menghasilkan 20. Pilih jawaban yang sesuai.</w:t>
-        <w:br/>
       </w:r>
     </w:p>
     <w:p>
@@ -812,47 +808,46 @@
     <w:p>
       <w:r>
         <w:t>Pembahasan Lengkap: Langkah Penyelesaian: Evaluasi ekspresi Kolam renang diisi air dengan debit 25 liter/detik. Jika volume kolam 180 m³, waktu untuk mengisi penuh kolam adalah... menghasilkan 180. Pilih jawaban yang sesuai.</w:t>
-        <w:br/>
       </w:r>
     </w:p>
     <w:p>
       <w:r>
-        <w:t>Soal 21 [PGK MCMA] (Data &amp; Statistika)</w:t>
+        <w:t>Soal 21 [PG] (Data &amp; Statistika)</w:t>
       </w:r>
     </w:p>
     <w:p>
       <w:r>
-        <w:t>Perhatikan diagram garis berikut!</w:t>
-        <w:br/>
-        <w:t>[GAMBAR: diagram_garis.png]</w:t>
-        <w:br/>
-        <w:t>Grafik menunjukkan tren kenaikan produksi padi selama 4 tahun berturut-turut.</w:t>
+        <w:t>Data nilai: 78, 85, 92, 76, 88. Rata‑rata (mean) nilai tersebut adalah...</w:t>
       </w:r>
     </w:p>
     <w:p>
       <w:r>
-        <w:t>A. Pengukuran volume</w:t>
+        <w:t>A. 84</w:t>
       </w:r>
     </w:p>
     <w:p>
       <w:r>
-        <w:t>B. Perhitungan keliling</w:t>
+        <w:t>B. 82</w:t>
       </w:r>
     </w:p>
     <w:p>
       <w:r>
-        <w:t>C. Penghitungan debit</w:t>
+        <w:t>C. 86</w:t>
       </w:r>
     </w:p>
     <w:p>
       <w:r>
-        <w:t>Kunci: A</w:t>
+        <w:t>D. 80</w:t>
       </w:r>
     </w:p>
     <w:p>
       <w:r>
-        <w:t>Pembahasan Lengkap: Pembahasan: Analisis konsep terkait soal 21.</w:t>
-        <w:br/>
+        <w:t>Kunci: B</w:t>
+      </w:r>
+    </w:p>
+    <w:p>
+      <w:r>
+        <w:t>Pembahasan: Mean = (78+85+92+76+88)/5 = 419/5 = 83.8 ≈ 84. Pilihan terdekat 84.</w:t>
       </w:r>
     </w:p>
     <w:p>
@@ -893,7 +888,6 @@
     <w:p>
       <w:r>
         <w:t>Pembahasan Lengkap: Langkah Penyelesaian: Evaluasi ekspresi Rata-rata 18 siswa adalah 80. Digabung beberapa siswa susulan, rata-rata jadi 78 (total 20 siswa). Rata-rata siswa susulan adalah... menghasilkan 20. Pilih jawaban yang sesuai.</w:t>
-        <w:br/>
       </w:r>
     </w:p>
     <w:p>
@@ -934,32 +928,36 @@
     <w:p>
       <w:r>
         <w:t>Pembahasan Lengkap: Langkah Penyelesaian: Evaluasi ekspresi Data nilai sains: 70, 75, 80, 85, 70, 90, 75, 70, 95, 85. Modus data tersebut adalah... menghasilkan 85. Pilih jawaban yang sesuai.</w:t>
-        <w:br/>
       </w:r>
     </w:p>
     <w:p>
       <w:r>
-        <w:t>Soal 24 [PGK Kategori] (Data &amp; Statistika)</w:t>
+        <w:t>Soal 24 [PG] (Data &amp; Statistika)</w:t>
       </w:r>
     </w:p>
     <w:p>
       <w:r>
-        <w:t>Manakah penyajian data yang umum digunakan di sekolah? (Pilih &gt;1)</w:t>
+        <w:t>Jika 30% dari siswa mendapat nilai A, dan kelas berisi 40 siswa, berapa siswa yang mendapat nilai A?</w:t>
       </w:r>
     </w:p>
     <w:p>
       <w:r>
-        <w:t>A. Opsi 1</w:t>
+        <w:t>A. 12</w:t>
       </w:r>
     </w:p>
     <w:p>
       <w:r>
-        <w:t>B. Opsi 2</w:t>
+        <w:t>B. 10</w:t>
       </w:r>
     </w:p>
     <w:p>
       <w:r>
-        <w:t>C. Opsi 3</w:t>
+        <w:t>C. 14</w:t>
+      </w:r>
+    </w:p>
+    <w:p>
+      <w:r>
+        <w:t>D. 8</w:t>
       </w:r>
     </w:p>
     <w:p>
@@ -969,8 +967,7 @@
     </w:p>
     <w:p>
       <w:r>
-        <w:t>Pembahasan Lengkap: Pembahasan: Analisis konsep terkait soal 24.</w:t>
-        <w:br/>
+        <w:t>Pembahasan: 30% × 40 = 0,3 × 40 = 12 siswa.</w:t>
       </w:r>
     </w:p>
     <w:p>
@@ -1011,7 +1008,6 @@
     <w:p>
       <w:r>
         <w:t>Pembahasan Lengkap: Langkah Penyelesaian: Evaluasi ekspresi Data tinggi badan 9 anak (cm): 135, 140, 138, 142, 145, 139, 141, 144, 137. Median tinggi badan adalah... menghasilkan 137. Pilih jawaban yang sesuai.</w:t>
-        <w:br/>
       </w:r>
     </w:p>
     <w:p>
@@ -1052,7 +1048,6 @@
     <w:p>
       <w:r>
         <w:t>Pembahasan Lengkap: Langkah Penyelesaian: Evaluasi ekspresi Diagram lingkaran 500 siswa hobi: Musik 30%, Olahraga 35%, Seni 25%, sisanya Membaca. Siswa hobi Membaca adalah... menghasilkan 25. Pilih jawaban yang sesuai.</w:t>
-        <w:br/>
       </w:r>
     </w:p>
     <w:p>
@@ -1088,7 +1083,6 @@
     <w:p>
       <w:r>
         <w:t>Pembahasan Lengkap: Pembahasan: Analisis konsep terkait soal 27.</w:t>
-        <w:br/>
       </w:r>
     </w:p>
     <w:p>
@@ -1129,7 +1123,6 @@
     <w:p>
       <w:r>
         <w:t>Pembahasan Lengkap: Langkah Penyelesaian: Evaluasi ekspresi Jangkauan data berat badan: 42, 50, 38, 65, 48, 55, 60 adalah... menghasilkan 60. Pilih jawaban yang sesuai.</w:t>
-        <w:br/>
       </w:r>
     </w:p>
     <w:p>
@@ -1170,7 +1163,6 @@
     <w:p>
       <w:r>
         <w:t>Pembahasan Lengkap: Langkah Penyelesaian: Evaluasi ekspresi Rata-rata 4 anak adalah 45 kg. Masuk 1 anak baru, rata-rata jadi 46 kg. Berat anak baru adalah... menghasilkan 46. Pilih jawaban yang sesuai.</w:t>
-        <w:br/>
       </w:r>
     </w:p>
     <w:p>
@@ -1206,7 +1198,6 @@
     <w:p>
       <w:r>
         <w:t>Pembahasan Lengkap: Pembahasan: Analisis konsep terkait soal 30.</w:t>
-        <w:br/>
       </w:r>
     </w:p>
     <w:sectPr>

</xml_diff>